<commit_message>
Ruffini: zeri razionali con coefficiente direttivo diverso da 1
Ricerca degli zeri tra ±p/q (p divisore del termine noto, q del
coefficiente direttivo), nuovo esempio con zero frazionario e schema
di Ruffini con frazioni, esercizio Prova tu aggiornato.

Co-Authored-By: Claude Opus 5.5 <noreply@anthropic.com>
Claude-Session: https://claude.ai/code/session_01TycPT2oHYz2LtR9gHJowT7
</commit_message>
<xml_diff>
--- a/Scomporre_un_Polinomio_Regole_Fondamentali_3L.docx
+++ b/Scomporre_un_Polinomio_Regole_Fondamentali_3L.docx
@@ -7748,6 +7748,67 @@
               </m:r>
             </m:oMath>
           </w:p>
+          <w:p>
+            <w:pPr>
+              <w:spacing w:after="40" w:before="40"/>
+              <w:jc w:val="center"/>
+            </w:pPr>
+            <w:r>
+              <w:rPr>
+                <w:b/>
+                <w:bCs/>
+              </w:rPr>
+              <w:t xml:space="preserve">Zeri possibili:  </w:t>
+            </w:r>
+            <m:oMath>
+              <m:r>
+                <m:t>k=±</m:t>
+              </m:r>
+              <m:f>
+                <m:num>
+                  <m:r>
+                    <m:t>p</m:t>
+                  </m:r>
+                </m:num>
+                <m:den>
+                  <m:r>
+                    <m:t>q</m:t>
+                  </m:r>
+                </m:den>
+              </m:f>
+            </m:oMath>
+            <w:r>
+              <w:rPr>
+                <w:b/>
+                <w:bCs/>
+              </w:rPr>
+              <w:t xml:space="preserve">   (</w:t>
+            </w:r>
+            <m:oMath>
+              <m:r>
+                <m:t>p</m:t>
+              </m:r>
+            </m:oMath>
+            <w:r>
+              <w:rPr>
+                <w:b/>
+                <w:bCs/>
+              </w:rPr>
+              <w:t xml:space="preserve"> divide il termine noto, </w:t>
+            </w:r>
+            <m:oMath>
+              <m:r>
+                <m:t>q</m:t>
+              </m:r>
+            </m:oMath>
+            <w:r>
+              <w:rPr>
+                <w:b/>
+                <w:bCs/>
+              </w:rPr>
+              <w:t xml:space="preserve"> il coefficiente direttivo)</w:t>
+            </w:r>
+          </w:p>
         </w:tc>
       </w:tr>
     </w:tbl>
@@ -7785,7 +7846,7 @@
         </m:r>
       </m:oMath>
       <w:r>
-        <w:t xml:space="preserve"> che annulla il polinomio, tra i divisori del termine noto: prova </w:t>
+        <w:t xml:space="preserve"> che annulla il polinomio. Se il coefficiente direttivo (il coefficiente del termine di grado massimo) è </w:t>
       </w:r>
       <m:oMath>
         <m:r>
@@ -7793,6 +7854,14 @@
         </m:r>
       </m:oMath>
       <w:r>
+        <w:t xml:space="preserve">, cercalo tra i divisori del termine noto: prova </w:t>
+      </w:r>
+      <m:oMath>
+        <m:r>
+          <m:t>1</m:t>
+        </m:r>
+      </m:oMath>
+      <w:r>
         <w:t xml:space="preserve">, </w:t>
       </w:r>
       <m:oMath>
@@ -7817,7 +7886,51 @@
         </m:r>
       </m:oMath>
       <w:r>
-        <w:t xml:space="preserve">, …</w:t>
+        <w:t xml:space="preserve">, … Se il coefficiente direttivo è diverso da </w:t>
+      </w:r>
+      <m:oMath>
+        <m:r>
+          <m:t>1</m:t>
+        </m:r>
+      </m:oMath>
+      <w:r>
+        <w:t xml:space="preserve">, cercalo tra le frazioni </w:t>
+      </w:r>
+      <m:oMath>
+        <m:r>
+          <m:t>±</m:t>
+        </m:r>
+        <m:f>
+          <m:num>
+            <m:r>
+              <m:t>p</m:t>
+            </m:r>
+          </m:num>
+          <m:den>
+            <m:r>
+              <m:t>q</m:t>
+            </m:r>
+          </m:den>
+        </m:f>
+      </m:oMath>
+      <w:r>
+        <w:t xml:space="preserve">, dove </w:t>
+      </w:r>
+      <m:oMath>
+        <m:r>
+          <m:t>p</m:t>
+        </m:r>
+      </m:oMath>
+      <w:r>
+        <w:t xml:space="preserve"> è un divisore del termine noto e </w:t>
+      </w:r>
+      <m:oMath>
+        <m:r>
+          <m:t>q</m:t>
+        </m:r>
+      </m:oMath>
+      <w:r>
+        <w:t xml:space="preserve"> un divisore del coefficiente direttivo.</w:t>
       </w:r>
     </w:p>
     <w:p>
@@ -7997,7 +8110,7 @@
     </w:p>
     <w:tbl>
       <w:tblPr>
-        <w:tblW w:type="dxa" w:w="3500"/>
+        <w:tblW w:type="dxa" w:w="3800"/>
         <w:jc w:val="center"/>
         <w:tblBorders>
           <w:top w:val="single" w:color="auto" w:sz="4"/>
@@ -8009,16 +8122,16 @@
         </w:tblBorders>
       </w:tblPr>
       <w:tblGrid>
-        <w:gridCol w:w="700"/>
-        <w:gridCol w:w="700"/>
-        <w:gridCol w:w="700"/>
-        <w:gridCol w:w="700"/>
-        <w:gridCol w:w="700"/>
+        <w:gridCol w:w="760"/>
+        <w:gridCol w:w="760"/>
+        <w:gridCol w:w="760"/>
+        <w:gridCol w:w="760"/>
+        <w:gridCol w:w="760"/>
       </w:tblGrid>
       <w:tr>
         <w:tc>
           <w:tcPr>
-            <w:tcW w:type="dxa" w:w="700"/>
+            <w:tcW w:type="dxa" w:w="760"/>
             <w:tcBorders>
               <w:top w:val="none" w:color="FFFFFF" w:sz="0"/>
               <w:left w:val="none" w:color="FFFFFF" w:sz="0"/>
@@ -8026,11 +8139,12 @@
               <w:right w:val="single" w:color="333333" w:sz="8"/>
             </w:tcBorders>
             <w:tcMar>
-              <w:top w:type="dxa" w:w="40"/>
+              <w:top w:type="dxa" w:w="30"/>
               <w:left w:type="dxa" w:w="60"/>
-              <w:bottom w:type="dxa" w:w="40"/>
+              <w:bottom w:type="dxa" w:w="30"/>
               <w:right w:type="dxa" w:w="60"/>
             </w:tcMar>
+            <w:vAlign w:val="center"/>
           </w:tcPr>
           <w:p>
             <w:pPr>
@@ -8040,7 +8154,7 @@
         </w:tc>
         <w:tc>
           <w:tcPr>
-            <w:tcW w:type="dxa" w:w="700"/>
+            <w:tcW w:type="dxa" w:w="760"/>
             <w:tcBorders>
               <w:top w:val="none" w:color="FFFFFF" w:sz="0"/>
               <w:left w:val="none" w:color="FFFFFF" w:sz="0"/>
@@ -8048,29 +8162,27 @@
               <w:right w:val="none" w:color="FFFFFF" w:sz="0"/>
             </w:tcBorders>
             <w:tcMar>
-              <w:top w:type="dxa" w:w="40"/>
+              <w:top w:type="dxa" w:w="30"/>
               <w:left w:type="dxa" w:w="60"/>
-              <w:bottom w:type="dxa" w:w="40"/>
+              <w:bottom w:type="dxa" w:w="30"/>
               <w:right w:type="dxa" w:w="60"/>
             </w:tcMar>
+            <w:vAlign w:val="center"/>
           </w:tcPr>
           <w:p>
             <w:pPr>
               <w:jc w:val="center"/>
             </w:pPr>
-            <w:r>
-              <w:rPr>
-                <w:rFonts w:ascii="Cambria Math" w:cs="Cambria Math" w:eastAsia="Cambria Math" w:hAnsi="Cambria Math"/>
-                <w:b w:val="false"/>
-                <w:bCs w:val="false"/>
-              </w:rPr>
-              <w:t xml:space="preserve">1</w:t>
-            </w:r>
+            <m:oMath>
+              <m:r>
+                <m:t>1</m:t>
+              </m:r>
+            </m:oMath>
           </w:p>
         </w:tc>
         <w:tc>
           <w:tcPr>
-            <w:tcW w:type="dxa" w:w="700"/>
+            <w:tcW w:type="dxa" w:w="760"/>
             <w:tcBorders>
               <w:top w:val="none" w:color="FFFFFF" w:sz="0"/>
               <w:left w:val="none" w:color="FFFFFF" w:sz="0"/>
@@ -8078,29 +8190,27 @@
               <w:right w:val="none" w:color="FFFFFF" w:sz="0"/>
             </w:tcBorders>
             <w:tcMar>
-              <w:top w:type="dxa" w:w="40"/>
+              <w:top w:type="dxa" w:w="30"/>
               <w:left w:type="dxa" w:w="60"/>
-              <w:bottom w:type="dxa" w:w="40"/>
+              <w:bottom w:type="dxa" w:w="30"/>
               <w:right w:type="dxa" w:w="60"/>
             </w:tcMar>
+            <w:vAlign w:val="center"/>
           </w:tcPr>
           <w:p>
             <w:pPr>
               <w:jc w:val="center"/>
             </w:pPr>
-            <w:r>
-              <w:rPr>
-                <w:rFonts w:ascii="Cambria Math" w:cs="Cambria Math" w:eastAsia="Cambria Math" w:hAnsi="Cambria Math"/>
-                <w:b w:val="false"/>
-                <w:bCs w:val="false"/>
-              </w:rPr>
-              <w:t xml:space="preserve">−4</w:t>
-            </w:r>
+            <m:oMath>
+              <m:r>
+                <m:t>−4</m:t>
+              </m:r>
+            </m:oMath>
           </w:p>
         </w:tc>
         <w:tc>
           <w:tcPr>
-            <w:tcW w:type="dxa" w:w="700"/>
+            <w:tcW w:type="dxa" w:w="760"/>
             <w:tcBorders>
               <w:top w:val="none" w:color="FFFFFF" w:sz="0"/>
               <w:left w:val="none" w:color="FFFFFF" w:sz="0"/>
@@ -8108,29 +8218,27 @@
               <w:right w:val="none" w:color="FFFFFF" w:sz="0"/>
             </w:tcBorders>
             <w:tcMar>
-              <w:top w:type="dxa" w:w="40"/>
+              <w:top w:type="dxa" w:w="30"/>
               <w:left w:type="dxa" w:w="60"/>
-              <w:bottom w:type="dxa" w:w="40"/>
+              <w:bottom w:type="dxa" w:w="30"/>
               <w:right w:type="dxa" w:w="60"/>
             </w:tcMar>
+            <w:vAlign w:val="center"/>
           </w:tcPr>
           <w:p>
             <w:pPr>
               <w:jc w:val="center"/>
             </w:pPr>
-            <w:r>
-              <w:rPr>
-                <w:rFonts w:ascii="Cambria Math" w:cs="Cambria Math" w:eastAsia="Cambria Math" w:hAnsi="Cambria Math"/>
-                <w:b w:val="false"/>
-                <w:bCs w:val="false"/>
-              </w:rPr>
-              <w:t xml:space="preserve">5</w:t>
-            </w:r>
+            <m:oMath>
+              <m:r>
+                <m:t>5</m:t>
+              </m:r>
+            </m:oMath>
           </w:p>
         </w:tc>
         <w:tc>
           <w:tcPr>
-            <w:tcW w:type="dxa" w:w="700"/>
+            <w:tcW w:type="dxa" w:w="760"/>
             <w:tcBorders>
               <w:top w:val="none" w:color="FFFFFF" w:sz="0"/>
               <w:left w:val="none" w:color="FFFFFF" w:sz="0"/>
@@ -8138,31 +8246,29 @@
               <w:right w:val="none" w:color="FFFFFF" w:sz="0"/>
             </w:tcBorders>
             <w:tcMar>
-              <w:top w:type="dxa" w:w="40"/>
+              <w:top w:type="dxa" w:w="30"/>
               <w:left w:type="dxa" w:w="60"/>
-              <w:bottom w:type="dxa" w:w="40"/>
+              <w:bottom w:type="dxa" w:w="30"/>
               <w:right w:type="dxa" w:w="60"/>
             </w:tcMar>
+            <w:vAlign w:val="center"/>
           </w:tcPr>
           <w:p>
             <w:pPr>
               <w:jc w:val="center"/>
             </w:pPr>
-            <w:r>
-              <w:rPr>
-                <w:rFonts w:ascii="Cambria Math" w:cs="Cambria Math" w:eastAsia="Cambria Math" w:hAnsi="Cambria Math"/>
-                <w:b w:val="false"/>
-                <w:bCs w:val="false"/>
-              </w:rPr>
-              <w:t xml:space="preserve">−2</w:t>
-            </w:r>
+            <m:oMath>
+              <m:r>
+                <m:t>−2</m:t>
+              </m:r>
+            </m:oMath>
           </w:p>
         </w:tc>
       </w:tr>
       <w:tr>
         <w:tc>
           <w:tcPr>
-            <w:tcW w:type="dxa" w:w="700"/>
+            <w:tcW w:type="dxa" w:w="760"/>
             <w:tcBorders>
               <w:top w:val="none" w:color="FFFFFF" w:sz="0"/>
               <w:left w:val="none" w:color="FFFFFF" w:sz="0"/>
@@ -8170,29 +8276,27 @@
               <w:right w:val="single" w:color="333333" w:sz="8"/>
             </w:tcBorders>
             <w:tcMar>
-              <w:top w:type="dxa" w:w="40"/>
+              <w:top w:type="dxa" w:w="30"/>
               <w:left w:type="dxa" w:w="60"/>
-              <w:bottom w:type="dxa" w:w="40"/>
+              <w:bottom w:type="dxa" w:w="30"/>
               <w:right w:type="dxa" w:w="60"/>
             </w:tcMar>
+            <w:vAlign w:val="center"/>
           </w:tcPr>
           <w:p>
             <w:pPr>
               <w:jc w:val="center"/>
             </w:pPr>
-            <w:r>
-              <w:rPr>
-                <w:rFonts w:ascii="Cambria Math" w:cs="Cambria Math" w:eastAsia="Cambria Math" w:hAnsi="Cambria Math"/>
-                <w:b w:val="false"/>
-                <w:bCs w:val="false"/>
-              </w:rPr>
-              <w:t xml:space="preserve">1</w:t>
-            </w:r>
+            <m:oMath>
+              <m:r>
+                <m:t>1</m:t>
+              </m:r>
+            </m:oMath>
           </w:p>
         </w:tc>
         <w:tc>
           <w:tcPr>
-            <w:tcW w:type="dxa" w:w="700"/>
+            <w:tcW w:type="dxa" w:w="760"/>
             <w:tcBorders>
               <w:top w:val="none" w:color="FFFFFF" w:sz="0"/>
               <w:left w:val="none" w:color="FFFFFF" w:sz="0"/>
@@ -8200,11 +8304,12 @@
               <w:right w:val="none" w:color="FFFFFF" w:sz="0"/>
             </w:tcBorders>
             <w:tcMar>
-              <w:top w:type="dxa" w:w="40"/>
+              <w:top w:type="dxa" w:w="30"/>
               <w:left w:type="dxa" w:w="60"/>
-              <w:bottom w:type="dxa" w:w="40"/>
+              <w:bottom w:type="dxa" w:w="30"/>
               <w:right w:type="dxa" w:w="60"/>
             </w:tcMar>
+            <w:vAlign w:val="center"/>
           </w:tcPr>
           <w:p>
             <w:pPr>
@@ -8214,7 +8319,7 @@
         </w:tc>
         <w:tc>
           <w:tcPr>
-            <w:tcW w:type="dxa" w:w="700"/>
+            <w:tcW w:type="dxa" w:w="760"/>
             <w:tcBorders>
               <w:top w:val="none" w:color="FFFFFF" w:sz="0"/>
               <w:left w:val="none" w:color="FFFFFF" w:sz="0"/>
@@ -8222,29 +8327,27 @@
               <w:right w:val="none" w:color="FFFFFF" w:sz="0"/>
             </w:tcBorders>
             <w:tcMar>
-              <w:top w:type="dxa" w:w="40"/>
+              <w:top w:type="dxa" w:w="30"/>
               <w:left w:type="dxa" w:w="60"/>
-              <w:bottom w:type="dxa" w:w="40"/>
+              <w:bottom w:type="dxa" w:w="30"/>
               <w:right w:type="dxa" w:w="60"/>
             </w:tcMar>
+            <w:vAlign w:val="center"/>
           </w:tcPr>
           <w:p>
             <w:pPr>
               <w:jc w:val="center"/>
             </w:pPr>
-            <w:r>
-              <w:rPr>
-                <w:rFonts w:ascii="Cambria Math" w:cs="Cambria Math" w:eastAsia="Cambria Math" w:hAnsi="Cambria Math"/>
-                <w:b w:val="false"/>
-                <w:bCs w:val="false"/>
-              </w:rPr>
-              <w:t xml:space="preserve">1</w:t>
-            </w:r>
+            <m:oMath>
+              <m:r>
+                <m:t>1</m:t>
+              </m:r>
+            </m:oMath>
           </w:p>
         </w:tc>
         <w:tc>
           <w:tcPr>
-            <w:tcW w:type="dxa" w:w="700"/>
+            <w:tcW w:type="dxa" w:w="760"/>
             <w:tcBorders>
               <w:top w:val="none" w:color="FFFFFF" w:sz="0"/>
               <w:left w:val="none" w:color="FFFFFF" w:sz="0"/>
@@ -8252,29 +8355,27 @@
               <w:right w:val="none" w:color="FFFFFF" w:sz="0"/>
             </w:tcBorders>
             <w:tcMar>
-              <w:top w:type="dxa" w:w="40"/>
+              <w:top w:type="dxa" w:w="30"/>
               <w:left w:type="dxa" w:w="60"/>
-              <w:bottom w:type="dxa" w:w="40"/>
+              <w:bottom w:type="dxa" w:w="30"/>
               <w:right w:type="dxa" w:w="60"/>
             </w:tcMar>
+            <w:vAlign w:val="center"/>
           </w:tcPr>
           <w:p>
             <w:pPr>
               <w:jc w:val="center"/>
             </w:pPr>
-            <w:r>
-              <w:rPr>
-                <w:rFonts w:ascii="Cambria Math" w:cs="Cambria Math" w:eastAsia="Cambria Math" w:hAnsi="Cambria Math"/>
-                <w:b w:val="false"/>
-                <w:bCs w:val="false"/>
-              </w:rPr>
-              <w:t xml:space="preserve">−3</w:t>
-            </w:r>
+            <m:oMath>
+              <m:r>
+                <m:t>−3</m:t>
+              </m:r>
+            </m:oMath>
           </w:p>
         </w:tc>
         <w:tc>
           <w:tcPr>
-            <w:tcW w:type="dxa" w:w="700"/>
+            <w:tcW w:type="dxa" w:w="760"/>
             <w:tcBorders>
               <w:top w:val="none" w:color="FFFFFF" w:sz="0"/>
               <w:left w:val="none" w:color="FFFFFF" w:sz="0"/>
@@ -8282,31 +8383,29 @@
               <w:right w:val="none" w:color="FFFFFF" w:sz="0"/>
             </w:tcBorders>
             <w:tcMar>
-              <w:top w:type="dxa" w:w="40"/>
+              <w:top w:type="dxa" w:w="30"/>
               <w:left w:type="dxa" w:w="60"/>
-              <w:bottom w:type="dxa" w:w="40"/>
+              <w:bottom w:type="dxa" w:w="30"/>
               <w:right w:type="dxa" w:w="60"/>
             </w:tcMar>
+            <w:vAlign w:val="center"/>
           </w:tcPr>
           <w:p>
             <w:pPr>
               <w:jc w:val="center"/>
             </w:pPr>
-            <w:r>
-              <w:rPr>
-                <w:rFonts w:ascii="Cambria Math" w:cs="Cambria Math" w:eastAsia="Cambria Math" w:hAnsi="Cambria Math"/>
-                <w:b w:val="false"/>
-                <w:bCs w:val="false"/>
-              </w:rPr>
-              <w:t xml:space="preserve">2</w:t>
-            </w:r>
+            <m:oMath>
+              <m:r>
+                <m:t>2</m:t>
+              </m:r>
+            </m:oMath>
           </w:p>
         </w:tc>
       </w:tr>
       <w:tr>
         <w:tc>
           <w:tcPr>
-            <w:tcW w:type="dxa" w:w="700"/>
+            <w:tcW w:type="dxa" w:w="760"/>
             <w:tcBorders>
               <w:top w:val="single" w:color="333333" w:sz="8"/>
               <w:left w:val="none" w:color="FFFFFF" w:sz="0"/>
@@ -8314,11 +8413,12 @@
               <w:right w:val="single" w:color="333333" w:sz="8"/>
             </w:tcBorders>
             <w:tcMar>
-              <w:top w:type="dxa" w:w="40"/>
+              <w:top w:type="dxa" w:w="30"/>
               <w:left w:type="dxa" w:w="60"/>
-              <w:bottom w:type="dxa" w:w="40"/>
+              <w:bottom w:type="dxa" w:w="30"/>
               <w:right w:type="dxa" w:w="60"/>
             </w:tcMar>
+            <w:vAlign w:val="center"/>
           </w:tcPr>
           <w:p>
             <w:pPr>
@@ -8328,7 +8428,7 @@
         </w:tc>
         <w:tc>
           <w:tcPr>
-            <w:tcW w:type="dxa" w:w="700"/>
+            <w:tcW w:type="dxa" w:w="760"/>
             <w:tcBorders>
               <w:top w:val="single" w:color="333333" w:sz="8"/>
               <w:left w:val="none" w:color="FFFFFF" w:sz="0"/>
@@ -8336,29 +8436,27 @@
               <w:right w:val="none" w:color="FFFFFF" w:sz="0"/>
             </w:tcBorders>
             <w:tcMar>
-              <w:top w:type="dxa" w:w="40"/>
+              <w:top w:type="dxa" w:w="30"/>
               <w:left w:type="dxa" w:w="60"/>
-              <w:bottom w:type="dxa" w:w="40"/>
+              <w:bottom w:type="dxa" w:w="30"/>
               <w:right w:type="dxa" w:w="60"/>
             </w:tcMar>
+            <w:vAlign w:val="center"/>
           </w:tcPr>
           <w:p>
             <w:pPr>
               <w:jc w:val="center"/>
             </w:pPr>
-            <w:r>
-              <w:rPr>
-                <w:rFonts w:ascii="Cambria Math" w:cs="Cambria Math" w:eastAsia="Cambria Math" w:hAnsi="Cambria Math"/>
-                <w:b/>
-                <w:bCs/>
-              </w:rPr>
-              <w:t xml:space="preserve">1</w:t>
-            </w:r>
+            <m:oMath>
+              <m:r>
+                <m:t>1</m:t>
+              </m:r>
+            </m:oMath>
           </w:p>
         </w:tc>
         <w:tc>
           <w:tcPr>
-            <w:tcW w:type="dxa" w:w="700"/>
+            <w:tcW w:type="dxa" w:w="760"/>
             <w:tcBorders>
               <w:top w:val="single" w:color="333333" w:sz="8"/>
               <w:left w:val="none" w:color="FFFFFF" w:sz="0"/>
@@ -8366,29 +8464,27 @@
               <w:right w:val="none" w:color="FFFFFF" w:sz="0"/>
             </w:tcBorders>
             <w:tcMar>
-              <w:top w:type="dxa" w:w="40"/>
+              <w:top w:type="dxa" w:w="30"/>
               <w:left w:type="dxa" w:w="60"/>
-              <w:bottom w:type="dxa" w:w="40"/>
+              <w:bottom w:type="dxa" w:w="30"/>
               <w:right w:type="dxa" w:w="60"/>
             </w:tcMar>
+            <w:vAlign w:val="center"/>
           </w:tcPr>
           <w:p>
             <w:pPr>
               <w:jc w:val="center"/>
             </w:pPr>
-            <w:r>
-              <w:rPr>
-                <w:rFonts w:ascii="Cambria Math" w:cs="Cambria Math" w:eastAsia="Cambria Math" w:hAnsi="Cambria Math"/>
-                <w:b/>
-                <w:bCs/>
-              </w:rPr>
-              <w:t xml:space="preserve">−3</w:t>
-            </w:r>
+            <m:oMath>
+              <m:r>
+                <m:t>−3</m:t>
+              </m:r>
+            </m:oMath>
           </w:p>
         </w:tc>
         <w:tc>
           <w:tcPr>
-            <w:tcW w:type="dxa" w:w="700"/>
+            <w:tcW w:type="dxa" w:w="760"/>
             <w:tcBorders>
               <w:top w:val="single" w:color="333333" w:sz="8"/>
               <w:left w:val="none" w:color="FFFFFF" w:sz="0"/>
@@ -8396,29 +8492,27 @@
               <w:right w:val="single" w:color="333333" w:sz="8"/>
             </w:tcBorders>
             <w:tcMar>
-              <w:top w:type="dxa" w:w="40"/>
+              <w:top w:type="dxa" w:w="30"/>
               <w:left w:type="dxa" w:w="60"/>
-              <w:bottom w:type="dxa" w:w="40"/>
+              <w:bottom w:type="dxa" w:w="30"/>
               <w:right w:type="dxa" w:w="60"/>
             </w:tcMar>
+            <w:vAlign w:val="center"/>
           </w:tcPr>
           <w:p>
             <w:pPr>
               <w:jc w:val="center"/>
             </w:pPr>
-            <w:r>
-              <w:rPr>
-                <w:rFonts w:ascii="Cambria Math" w:cs="Cambria Math" w:eastAsia="Cambria Math" w:hAnsi="Cambria Math"/>
-                <w:b/>
-                <w:bCs/>
-              </w:rPr>
-              <w:t xml:space="preserve">2</w:t>
-            </w:r>
+            <m:oMath>
+              <m:r>
+                <m:t>2</m:t>
+              </m:r>
+            </m:oMath>
           </w:p>
         </w:tc>
         <w:tc>
           <w:tcPr>
-            <w:tcW w:type="dxa" w:w="700"/>
+            <w:tcW w:type="dxa" w:w="760"/>
             <w:tcBorders>
               <w:top w:val="single" w:color="333333" w:sz="8"/>
               <w:left w:val="none" w:color="FFFFFF" w:sz="0"/>
@@ -8426,24 +8520,22 @@
               <w:right w:val="none" w:color="FFFFFF" w:sz="0"/>
             </w:tcBorders>
             <w:tcMar>
-              <w:top w:type="dxa" w:w="40"/>
+              <w:top w:type="dxa" w:w="30"/>
               <w:left w:type="dxa" w:w="60"/>
-              <w:bottom w:type="dxa" w:w="40"/>
+              <w:bottom w:type="dxa" w:w="30"/>
               <w:right w:type="dxa" w:w="60"/>
             </w:tcMar>
+            <w:vAlign w:val="center"/>
           </w:tcPr>
           <w:p>
             <w:pPr>
               <w:jc w:val="center"/>
             </w:pPr>
-            <w:r>
-              <w:rPr>
-                <w:rFonts w:ascii="Cambria Math" w:cs="Cambria Math" w:eastAsia="Cambria Math" w:hAnsi="Cambria Math"/>
-                <w:b/>
-                <w:bCs/>
-              </w:rPr>
-              <w:t xml:space="preserve">0</w:t>
-            </w:r>
+            <m:oMath>
+              <m:r>
+                <m:t>0</m:t>
+              </m:r>
+            </m:oMath>
           </w:p>
         </w:tc>
       </w:tr>
@@ -8573,11 +8665,14 @@
         <w:t xml:space="preserve">      </w:t>
       </w:r>
       <m:oMath>
+        <m:r>
+          <m:t>2</m:t>
+        </m:r>
         <m:sSup>
           <m:sSupPr/>
           <m:e>
             <m:r>
-              <m:t>t</m:t>
+              <m:t>x</m:t>
             </m:r>
           </m:e>
           <m:sup>
@@ -8587,13 +8682,13 @@
           </m:sup>
         </m:sSup>
         <m:r>
-          <m:t>+2</m:t>
+          <m:t>+</m:t>
         </m:r>
         <m:sSup>
           <m:sSupPr/>
           <m:e>
             <m:r>
-              <m:t>t</m:t>
+              <m:t>x</m:t>
             </m:r>
           </m:e>
           <m:sup>
@@ -8603,7 +8698,7 @@
           </m:sup>
         </m:sSup>
         <m:r>
-          <m:t>−5t−6</m:t>
+          <m:t>+x−1</m:t>
         </m:r>
       </m:oMath>
     </w:p>
@@ -8619,35 +8714,151 @@
         <w:spacing w:after="40" w:before="20"/>
       </w:pPr>
       <w:r>
-        <w:t xml:space="preserve">Provo </w:t>
-      </w:r>
-      <m:oMath>
-        <m:r>
-          <m:t>t=1</m:t>
-        </m:r>
-      </m:oMath>
-      <w:r>
-        <w:t xml:space="preserve">: </w:t>
-      </w:r>
-      <m:oMath>
-        <m:r>
-          <m:t>1+2−5−6=−8≠0</m:t>
-        </m:r>
-      </m:oMath>
-      <w:r>
-        <w:t xml:space="preserve">. Provo </w:t>
-      </w:r>
-      <m:oMath>
-        <m:r>
-          <m:t>t=−1</m:t>
-        </m:r>
-      </m:oMath>
-      <w:r>
-        <w:t xml:space="preserve">: </w:t>
-      </w:r>
-      <m:oMath>
-        <m:r>
-          <m:t>−1+2+5−6=0</m:t>
+        <w:t xml:space="preserve">Il coefficiente direttivo è </w:t>
+      </w:r>
+      <m:oMath>
+        <m:r>
+          <m:t>2</m:t>
+        </m:r>
+      </m:oMath>
+      <w:r>
+        <w:t xml:space="preserve">: i possibili zeri sono </w:t>
+      </w:r>
+      <m:oMath>
+        <m:r>
+          <m:t>±1</m:t>
+        </m:r>
+      </m:oMath>
+      <w:r>
+        <w:t xml:space="preserve"> e </w:t>
+      </w:r>
+      <m:oMath>
+        <m:r>
+          <m:t>±</m:t>
+        </m:r>
+        <m:f>
+          <m:num>
+            <m:r>
+              <m:t>1</m:t>
+            </m:r>
+          </m:num>
+          <m:den>
+            <m:r>
+              <m:t>2</m:t>
+            </m:r>
+          </m:den>
+        </m:f>
+      </m:oMath>
+      <w:r>
+        <w:t xml:space="preserve"> (divisori di </w:t>
+      </w:r>
+      <m:oMath>
+        <m:r>
+          <m:t>1</m:t>
+        </m:r>
+      </m:oMath>
+      <w:r>
+        <w:t xml:space="preserve"> fratto divisori di </w:t>
+      </w:r>
+      <m:oMath>
+        <m:r>
+          <m:t>2</m:t>
+        </m:r>
+      </m:oMath>
+      <w:r>
+        <w:t xml:space="preserve">).</w:t>
+      </w:r>
+    </w:p>
+    <w:p>
+      <w:pPr>
+        <w:pStyle w:val="ListParagraph"/>
+        <w:keepNext/>
+        <w:keepLines/>
+        <w:numPr>
+          <w:ilvl w:val="0"/>
+          <w:numId w:val="4"/>
+        </w:numPr>
+        <w:spacing w:after="40" w:before="20"/>
+      </w:pPr>
+      <m:oMath>
+        <m:r>
+          <m:t>P(1)=3≠0</m:t>
+        </m:r>
+      </m:oMath>
+      <w:r>
+        <w:t xml:space="preserve">;  </w:t>
+      </w:r>
+      <m:oMath>
+        <m:r>
+          <m:t>P(−1)=−3≠0</m:t>
+        </m:r>
+      </m:oMath>
+      <w:r>
+        <w:t xml:space="preserve">;  </w:t>
+      </w:r>
+      <m:oMath>
+        <m:r>
+          <m:t>P(</m:t>
+        </m:r>
+        <m:f>
+          <m:num>
+            <m:r>
+              <m:t>1</m:t>
+            </m:r>
+          </m:num>
+          <m:den>
+            <m:r>
+              <m:t>2</m:t>
+            </m:r>
+          </m:den>
+        </m:f>
+        <m:r>
+          <m:t>)=</m:t>
+        </m:r>
+        <m:f>
+          <m:num>
+            <m:r>
+              <m:t>1</m:t>
+            </m:r>
+          </m:num>
+          <m:den>
+            <m:r>
+              <m:t>4</m:t>
+            </m:r>
+          </m:den>
+        </m:f>
+        <m:r>
+          <m:t>+</m:t>
+        </m:r>
+        <m:f>
+          <m:num>
+            <m:r>
+              <m:t>1</m:t>
+            </m:r>
+          </m:num>
+          <m:den>
+            <m:r>
+              <m:t>4</m:t>
+            </m:r>
+          </m:den>
+        </m:f>
+        <m:r>
+          <m:t>+</m:t>
+        </m:r>
+        <m:f>
+          <m:num>
+            <m:r>
+              <m:t>1</m:t>
+            </m:r>
+          </m:num>
+          <m:den>
+            <m:r>
+              <m:t>2</m:t>
+            </m:r>
+          </m:den>
+        </m:f>
+        <m:r>
+          <m:t>−1=0</m:t>
         </m:r>
       </m:oMath>
       <w:r>
@@ -8655,7 +8866,22 @@
       </w:r>
       <m:oMath>
         <m:r>
-          <m:t>(t+1)</m:t>
+          <m:t>(x−</m:t>
+        </m:r>
+        <m:f>
+          <m:num>
+            <m:r>
+              <m:t>1</m:t>
+            </m:r>
+          </m:num>
+          <m:den>
+            <m:r>
+              <m:t>2</m:t>
+            </m:r>
+          </m:den>
+        </m:f>
+        <m:r>
+          <m:t>)</m:t>
         </m:r>
       </m:oMath>
       <w:r>
@@ -8664,7 +8890,7 @@
     </w:p>
     <w:tbl>
       <w:tblPr>
-        <w:tblW w:type="dxa" w:w="3500"/>
+        <w:tblW w:type="dxa" w:w="3800"/>
         <w:jc w:val="center"/>
         <w:tblBorders>
           <w:top w:val="single" w:color="auto" w:sz="4"/>
@@ -8676,16 +8902,16 @@
         </w:tblBorders>
       </w:tblPr>
       <w:tblGrid>
-        <w:gridCol w:w="700"/>
-        <w:gridCol w:w="700"/>
-        <w:gridCol w:w="700"/>
-        <w:gridCol w:w="700"/>
-        <w:gridCol w:w="700"/>
+        <w:gridCol w:w="760"/>
+        <w:gridCol w:w="760"/>
+        <w:gridCol w:w="760"/>
+        <w:gridCol w:w="760"/>
+        <w:gridCol w:w="760"/>
       </w:tblGrid>
       <w:tr>
         <w:tc>
           <w:tcPr>
-            <w:tcW w:type="dxa" w:w="700"/>
+            <w:tcW w:type="dxa" w:w="760"/>
             <w:tcBorders>
               <w:top w:val="none" w:color="FFFFFF" w:sz="0"/>
               <w:left w:val="none" w:color="FFFFFF" w:sz="0"/>
@@ -8693,11 +8919,12 @@
               <w:right w:val="single" w:color="333333" w:sz="8"/>
             </w:tcBorders>
             <w:tcMar>
-              <w:top w:type="dxa" w:w="40"/>
+              <w:top w:type="dxa" w:w="30"/>
               <w:left w:type="dxa" w:w="60"/>
-              <w:bottom w:type="dxa" w:w="40"/>
+              <w:bottom w:type="dxa" w:w="30"/>
               <w:right w:type="dxa" w:w="60"/>
             </w:tcMar>
+            <w:vAlign w:val="center"/>
           </w:tcPr>
           <w:p>
             <w:pPr>
@@ -8707,7 +8934,7 @@
         </w:tc>
         <w:tc>
           <w:tcPr>
-            <w:tcW w:type="dxa" w:w="700"/>
+            <w:tcW w:type="dxa" w:w="760"/>
             <w:tcBorders>
               <w:top w:val="none" w:color="FFFFFF" w:sz="0"/>
               <w:left w:val="none" w:color="FFFFFF" w:sz="0"/>
@@ -8715,29 +8942,27 @@
               <w:right w:val="none" w:color="FFFFFF" w:sz="0"/>
             </w:tcBorders>
             <w:tcMar>
-              <w:top w:type="dxa" w:w="40"/>
+              <w:top w:type="dxa" w:w="30"/>
               <w:left w:type="dxa" w:w="60"/>
-              <w:bottom w:type="dxa" w:w="40"/>
+              <w:bottom w:type="dxa" w:w="30"/>
               <w:right w:type="dxa" w:w="60"/>
             </w:tcMar>
+            <w:vAlign w:val="center"/>
           </w:tcPr>
           <w:p>
             <w:pPr>
               <w:jc w:val="center"/>
             </w:pPr>
-            <w:r>
-              <w:rPr>
-                <w:rFonts w:ascii="Cambria Math" w:cs="Cambria Math" w:eastAsia="Cambria Math" w:hAnsi="Cambria Math"/>
-                <w:b w:val="false"/>
-                <w:bCs w:val="false"/>
-              </w:rPr>
-              <w:t xml:space="preserve">1</w:t>
-            </w:r>
+            <m:oMath>
+              <m:r>
+                <m:t>2</m:t>
+              </m:r>
+            </m:oMath>
           </w:p>
         </w:tc>
         <w:tc>
           <w:tcPr>
-            <w:tcW w:type="dxa" w:w="700"/>
+            <w:tcW w:type="dxa" w:w="760"/>
             <w:tcBorders>
               <w:top w:val="none" w:color="FFFFFF" w:sz="0"/>
               <w:left w:val="none" w:color="FFFFFF" w:sz="0"/>
@@ -8745,29 +8970,27 @@
               <w:right w:val="none" w:color="FFFFFF" w:sz="0"/>
             </w:tcBorders>
             <w:tcMar>
-              <w:top w:type="dxa" w:w="40"/>
+              <w:top w:type="dxa" w:w="30"/>
               <w:left w:type="dxa" w:w="60"/>
-              <w:bottom w:type="dxa" w:w="40"/>
+              <w:bottom w:type="dxa" w:w="30"/>
               <w:right w:type="dxa" w:w="60"/>
             </w:tcMar>
+            <w:vAlign w:val="center"/>
           </w:tcPr>
           <w:p>
             <w:pPr>
               <w:jc w:val="center"/>
             </w:pPr>
-            <w:r>
-              <w:rPr>
-                <w:rFonts w:ascii="Cambria Math" w:cs="Cambria Math" w:eastAsia="Cambria Math" w:hAnsi="Cambria Math"/>
-                <w:b w:val="false"/>
-                <w:bCs w:val="false"/>
-              </w:rPr>
-              <w:t xml:space="preserve">2</w:t>
-            </w:r>
+            <m:oMath>
+              <m:r>
+                <m:t>1</m:t>
+              </m:r>
+            </m:oMath>
           </w:p>
         </w:tc>
         <w:tc>
           <w:tcPr>
-            <w:tcW w:type="dxa" w:w="700"/>
+            <w:tcW w:type="dxa" w:w="760"/>
             <w:tcBorders>
               <w:top w:val="none" w:color="FFFFFF" w:sz="0"/>
               <w:left w:val="none" w:color="FFFFFF" w:sz="0"/>
@@ -8775,29 +8998,27 @@
               <w:right w:val="none" w:color="FFFFFF" w:sz="0"/>
             </w:tcBorders>
             <w:tcMar>
-              <w:top w:type="dxa" w:w="40"/>
+              <w:top w:type="dxa" w:w="30"/>
               <w:left w:type="dxa" w:w="60"/>
-              <w:bottom w:type="dxa" w:w="40"/>
+              <w:bottom w:type="dxa" w:w="30"/>
               <w:right w:type="dxa" w:w="60"/>
             </w:tcMar>
+            <w:vAlign w:val="center"/>
           </w:tcPr>
           <w:p>
             <w:pPr>
               <w:jc w:val="center"/>
             </w:pPr>
-            <w:r>
-              <w:rPr>
-                <w:rFonts w:ascii="Cambria Math" w:cs="Cambria Math" w:eastAsia="Cambria Math" w:hAnsi="Cambria Math"/>
-                <w:b w:val="false"/>
-                <w:bCs w:val="false"/>
-              </w:rPr>
-              <w:t xml:space="preserve">−5</w:t>
-            </w:r>
+            <m:oMath>
+              <m:r>
+                <m:t>1</m:t>
+              </m:r>
+            </m:oMath>
           </w:p>
         </w:tc>
         <w:tc>
           <w:tcPr>
-            <w:tcW w:type="dxa" w:w="700"/>
+            <w:tcW w:type="dxa" w:w="760"/>
             <w:tcBorders>
               <w:top w:val="none" w:color="FFFFFF" w:sz="0"/>
               <w:left w:val="none" w:color="FFFFFF" w:sz="0"/>
@@ -8805,31 +9026,29 @@
               <w:right w:val="none" w:color="FFFFFF" w:sz="0"/>
             </w:tcBorders>
             <w:tcMar>
-              <w:top w:type="dxa" w:w="40"/>
+              <w:top w:type="dxa" w:w="30"/>
               <w:left w:type="dxa" w:w="60"/>
-              <w:bottom w:type="dxa" w:w="40"/>
+              <w:bottom w:type="dxa" w:w="30"/>
               <w:right w:type="dxa" w:w="60"/>
             </w:tcMar>
+            <w:vAlign w:val="center"/>
           </w:tcPr>
           <w:p>
             <w:pPr>
               <w:jc w:val="center"/>
             </w:pPr>
-            <w:r>
-              <w:rPr>
-                <w:rFonts w:ascii="Cambria Math" w:cs="Cambria Math" w:eastAsia="Cambria Math" w:hAnsi="Cambria Math"/>
-                <w:b w:val="false"/>
-                <w:bCs w:val="false"/>
-              </w:rPr>
-              <w:t xml:space="preserve">−6</w:t>
-            </w:r>
+            <m:oMath>
+              <m:r>
+                <m:t>−1</m:t>
+              </m:r>
+            </m:oMath>
           </w:p>
         </w:tc>
       </w:tr>
       <w:tr>
         <w:tc>
           <w:tcPr>
-            <w:tcW w:type="dxa" w:w="700"/>
+            <w:tcW w:type="dxa" w:w="760"/>
             <w:tcBorders>
               <w:top w:val="none" w:color="FFFFFF" w:sz="0"/>
               <w:left w:val="none" w:color="FFFFFF" w:sz="0"/>
@@ -8837,29 +9056,36 @@
               <w:right w:val="single" w:color="333333" w:sz="8"/>
             </w:tcBorders>
             <w:tcMar>
-              <w:top w:type="dxa" w:w="40"/>
+              <w:top w:type="dxa" w:w="30"/>
               <w:left w:type="dxa" w:w="60"/>
-              <w:bottom w:type="dxa" w:w="40"/>
+              <w:bottom w:type="dxa" w:w="30"/>
               <w:right w:type="dxa" w:w="60"/>
             </w:tcMar>
+            <w:vAlign w:val="center"/>
           </w:tcPr>
           <w:p>
             <w:pPr>
               <w:jc w:val="center"/>
             </w:pPr>
-            <w:r>
-              <w:rPr>
-                <w:rFonts w:ascii="Cambria Math" w:cs="Cambria Math" w:eastAsia="Cambria Math" w:hAnsi="Cambria Math"/>
-                <w:b w:val="false"/>
-                <w:bCs w:val="false"/>
-              </w:rPr>
-              <w:t xml:space="preserve">−1</w:t>
-            </w:r>
+            <m:oMath>
+              <m:f>
+                <m:num>
+                  <m:r>
+                    <m:t>1</m:t>
+                  </m:r>
+                </m:num>
+                <m:den>
+                  <m:r>
+                    <m:t>2</m:t>
+                  </m:r>
+                </m:den>
+              </m:f>
+            </m:oMath>
           </w:p>
         </w:tc>
         <w:tc>
           <w:tcPr>
-            <w:tcW w:type="dxa" w:w="700"/>
+            <w:tcW w:type="dxa" w:w="760"/>
             <w:tcBorders>
               <w:top w:val="none" w:color="FFFFFF" w:sz="0"/>
               <w:left w:val="none" w:color="FFFFFF" w:sz="0"/>
@@ -8867,11 +9093,12 @@
               <w:right w:val="none" w:color="FFFFFF" w:sz="0"/>
             </w:tcBorders>
             <w:tcMar>
-              <w:top w:type="dxa" w:w="40"/>
+              <w:top w:type="dxa" w:w="30"/>
               <w:left w:type="dxa" w:w="60"/>
-              <w:bottom w:type="dxa" w:w="40"/>
+              <w:bottom w:type="dxa" w:w="30"/>
               <w:right w:type="dxa" w:w="60"/>
             </w:tcMar>
+            <w:vAlign w:val="center"/>
           </w:tcPr>
           <w:p>
             <w:pPr>
@@ -8881,7 +9108,7 @@
         </w:tc>
         <w:tc>
           <w:tcPr>
-            <w:tcW w:type="dxa" w:w="700"/>
+            <w:tcW w:type="dxa" w:w="760"/>
             <w:tcBorders>
               <w:top w:val="none" w:color="FFFFFF" w:sz="0"/>
               <w:left w:val="none" w:color="FFFFFF" w:sz="0"/>
@@ -8889,29 +9116,27 @@
               <w:right w:val="none" w:color="FFFFFF" w:sz="0"/>
             </w:tcBorders>
             <w:tcMar>
-              <w:top w:type="dxa" w:w="40"/>
+              <w:top w:type="dxa" w:w="30"/>
               <w:left w:type="dxa" w:w="60"/>
-              <w:bottom w:type="dxa" w:w="40"/>
+              <w:bottom w:type="dxa" w:w="30"/>
               <w:right w:type="dxa" w:w="60"/>
             </w:tcMar>
+            <w:vAlign w:val="center"/>
           </w:tcPr>
           <w:p>
             <w:pPr>
               <w:jc w:val="center"/>
             </w:pPr>
-            <w:r>
-              <w:rPr>
-                <w:rFonts w:ascii="Cambria Math" w:cs="Cambria Math" w:eastAsia="Cambria Math" w:hAnsi="Cambria Math"/>
-                <w:b w:val="false"/>
-                <w:bCs w:val="false"/>
-              </w:rPr>
-              <w:t xml:space="preserve">−1</w:t>
-            </w:r>
+            <m:oMath>
+              <m:r>
+                <m:t>1</m:t>
+              </m:r>
+            </m:oMath>
           </w:p>
         </w:tc>
         <w:tc>
           <w:tcPr>
-            <w:tcW w:type="dxa" w:w="700"/>
+            <w:tcW w:type="dxa" w:w="760"/>
             <w:tcBorders>
               <w:top w:val="none" w:color="FFFFFF" w:sz="0"/>
               <w:left w:val="none" w:color="FFFFFF" w:sz="0"/>
@@ -8919,29 +9144,27 @@
               <w:right w:val="none" w:color="FFFFFF" w:sz="0"/>
             </w:tcBorders>
             <w:tcMar>
-              <w:top w:type="dxa" w:w="40"/>
+              <w:top w:type="dxa" w:w="30"/>
               <w:left w:type="dxa" w:w="60"/>
-              <w:bottom w:type="dxa" w:w="40"/>
+              <w:bottom w:type="dxa" w:w="30"/>
               <w:right w:type="dxa" w:w="60"/>
             </w:tcMar>
+            <w:vAlign w:val="center"/>
           </w:tcPr>
           <w:p>
             <w:pPr>
               <w:jc w:val="center"/>
             </w:pPr>
-            <w:r>
-              <w:rPr>
-                <w:rFonts w:ascii="Cambria Math" w:cs="Cambria Math" w:eastAsia="Cambria Math" w:hAnsi="Cambria Math"/>
-                <w:b w:val="false"/>
-                <w:bCs w:val="false"/>
-              </w:rPr>
-              <w:t xml:space="preserve">−1</w:t>
-            </w:r>
+            <m:oMath>
+              <m:r>
+                <m:t>1</m:t>
+              </m:r>
+            </m:oMath>
           </w:p>
         </w:tc>
         <w:tc>
           <w:tcPr>
-            <w:tcW w:type="dxa" w:w="700"/>
+            <w:tcW w:type="dxa" w:w="760"/>
             <w:tcBorders>
               <w:top w:val="none" w:color="FFFFFF" w:sz="0"/>
               <w:left w:val="none" w:color="FFFFFF" w:sz="0"/>
@@ -8949,31 +9172,29 @@
               <w:right w:val="none" w:color="FFFFFF" w:sz="0"/>
             </w:tcBorders>
             <w:tcMar>
-              <w:top w:type="dxa" w:w="40"/>
+              <w:top w:type="dxa" w:w="30"/>
               <w:left w:type="dxa" w:w="60"/>
-              <w:bottom w:type="dxa" w:w="40"/>
+              <w:bottom w:type="dxa" w:w="30"/>
               <w:right w:type="dxa" w:w="60"/>
             </w:tcMar>
+            <w:vAlign w:val="center"/>
           </w:tcPr>
           <w:p>
             <w:pPr>
               <w:jc w:val="center"/>
             </w:pPr>
-            <w:r>
-              <w:rPr>
-                <w:rFonts w:ascii="Cambria Math" w:cs="Cambria Math" w:eastAsia="Cambria Math" w:hAnsi="Cambria Math"/>
-                <w:b w:val="false"/>
-                <w:bCs w:val="false"/>
-              </w:rPr>
-              <w:t xml:space="preserve">6</w:t>
-            </w:r>
+            <m:oMath>
+              <m:r>
+                <m:t>1</m:t>
+              </m:r>
+            </m:oMath>
           </w:p>
         </w:tc>
       </w:tr>
       <w:tr>
         <w:tc>
           <w:tcPr>
-            <w:tcW w:type="dxa" w:w="700"/>
+            <w:tcW w:type="dxa" w:w="760"/>
             <w:tcBorders>
               <w:top w:val="single" w:color="333333" w:sz="8"/>
               <w:left w:val="none" w:color="FFFFFF" w:sz="0"/>
@@ -8981,11 +9202,12 @@
               <w:right w:val="single" w:color="333333" w:sz="8"/>
             </w:tcBorders>
             <w:tcMar>
-              <w:top w:type="dxa" w:w="40"/>
+              <w:top w:type="dxa" w:w="30"/>
               <w:left w:type="dxa" w:w="60"/>
-              <w:bottom w:type="dxa" w:w="40"/>
+              <w:bottom w:type="dxa" w:w="30"/>
               <w:right w:type="dxa" w:w="60"/>
             </w:tcMar>
+            <w:vAlign w:val="center"/>
           </w:tcPr>
           <w:p>
             <w:pPr>
@@ -8995,7 +9217,7 @@
         </w:tc>
         <w:tc>
           <w:tcPr>
-            <w:tcW w:type="dxa" w:w="700"/>
+            <w:tcW w:type="dxa" w:w="760"/>
             <w:tcBorders>
               <w:top w:val="single" w:color="333333" w:sz="8"/>
               <w:left w:val="none" w:color="FFFFFF" w:sz="0"/>
@@ -9003,29 +9225,27 @@
               <w:right w:val="none" w:color="FFFFFF" w:sz="0"/>
             </w:tcBorders>
             <w:tcMar>
-              <w:top w:type="dxa" w:w="40"/>
+              <w:top w:type="dxa" w:w="30"/>
               <w:left w:type="dxa" w:w="60"/>
-              <w:bottom w:type="dxa" w:w="40"/>
+              <w:bottom w:type="dxa" w:w="30"/>
               <w:right w:type="dxa" w:w="60"/>
             </w:tcMar>
+            <w:vAlign w:val="center"/>
           </w:tcPr>
           <w:p>
             <w:pPr>
               <w:jc w:val="center"/>
             </w:pPr>
-            <w:r>
-              <w:rPr>
-                <w:rFonts w:ascii="Cambria Math" w:cs="Cambria Math" w:eastAsia="Cambria Math" w:hAnsi="Cambria Math"/>
-                <w:b/>
-                <w:bCs/>
-              </w:rPr>
-              <w:t xml:space="preserve">1</w:t>
-            </w:r>
+            <m:oMath>
+              <m:r>
+                <m:t>2</m:t>
+              </m:r>
+            </m:oMath>
           </w:p>
         </w:tc>
         <w:tc>
           <w:tcPr>
-            <w:tcW w:type="dxa" w:w="700"/>
+            <w:tcW w:type="dxa" w:w="760"/>
             <w:tcBorders>
               <w:top w:val="single" w:color="333333" w:sz="8"/>
               <w:left w:val="none" w:color="FFFFFF" w:sz="0"/>
@@ -9033,29 +9253,27 @@
               <w:right w:val="none" w:color="FFFFFF" w:sz="0"/>
             </w:tcBorders>
             <w:tcMar>
-              <w:top w:type="dxa" w:w="40"/>
+              <w:top w:type="dxa" w:w="30"/>
               <w:left w:type="dxa" w:w="60"/>
-              <w:bottom w:type="dxa" w:w="40"/>
+              <w:bottom w:type="dxa" w:w="30"/>
               <w:right w:type="dxa" w:w="60"/>
             </w:tcMar>
+            <w:vAlign w:val="center"/>
           </w:tcPr>
           <w:p>
             <w:pPr>
               <w:jc w:val="center"/>
             </w:pPr>
-            <w:r>
-              <w:rPr>
-                <w:rFonts w:ascii="Cambria Math" w:cs="Cambria Math" w:eastAsia="Cambria Math" w:hAnsi="Cambria Math"/>
-                <w:b/>
-                <w:bCs/>
-              </w:rPr>
-              <w:t xml:space="preserve">1</w:t>
-            </w:r>
+            <m:oMath>
+              <m:r>
+                <m:t>2</m:t>
+              </m:r>
+            </m:oMath>
           </w:p>
         </w:tc>
         <w:tc>
           <w:tcPr>
-            <w:tcW w:type="dxa" w:w="700"/>
+            <w:tcW w:type="dxa" w:w="760"/>
             <w:tcBorders>
               <w:top w:val="single" w:color="333333" w:sz="8"/>
               <w:left w:val="none" w:color="FFFFFF" w:sz="0"/>
@@ -9063,29 +9281,27 @@
               <w:right w:val="single" w:color="333333" w:sz="8"/>
             </w:tcBorders>
             <w:tcMar>
-              <w:top w:type="dxa" w:w="40"/>
+              <w:top w:type="dxa" w:w="30"/>
               <w:left w:type="dxa" w:w="60"/>
-              <w:bottom w:type="dxa" w:w="40"/>
+              <w:bottom w:type="dxa" w:w="30"/>
               <w:right w:type="dxa" w:w="60"/>
             </w:tcMar>
+            <w:vAlign w:val="center"/>
           </w:tcPr>
           <w:p>
             <w:pPr>
               <w:jc w:val="center"/>
             </w:pPr>
-            <w:r>
-              <w:rPr>
-                <w:rFonts w:ascii="Cambria Math" w:cs="Cambria Math" w:eastAsia="Cambria Math" w:hAnsi="Cambria Math"/>
-                <w:b/>
-                <w:bCs/>
-              </w:rPr>
-              <w:t xml:space="preserve">−6</w:t>
-            </w:r>
+            <m:oMath>
+              <m:r>
+                <m:t>2</m:t>
+              </m:r>
+            </m:oMath>
           </w:p>
         </w:tc>
         <w:tc>
           <w:tcPr>
-            <w:tcW w:type="dxa" w:w="700"/>
+            <w:tcW w:type="dxa" w:w="760"/>
             <w:tcBorders>
               <w:top w:val="single" w:color="333333" w:sz="8"/>
               <w:left w:val="none" w:color="FFFFFF" w:sz="0"/>
@@ -9093,24 +9309,22 @@
               <w:right w:val="none" w:color="FFFFFF" w:sz="0"/>
             </w:tcBorders>
             <w:tcMar>
-              <w:top w:type="dxa" w:w="40"/>
+              <w:top w:type="dxa" w:w="30"/>
               <w:left w:type="dxa" w:w="60"/>
-              <w:bottom w:type="dxa" w:w="40"/>
+              <w:bottom w:type="dxa" w:w="30"/>
               <w:right w:type="dxa" w:w="60"/>
             </w:tcMar>
+            <w:vAlign w:val="center"/>
           </w:tcPr>
           <w:p>
             <w:pPr>
               <w:jc w:val="center"/>
             </w:pPr>
-            <w:r>
-              <w:rPr>
-                <w:rFonts w:ascii="Cambria Math" w:cs="Cambria Math" w:eastAsia="Cambria Math" w:hAnsi="Cambria Math"/>
-                <w:b/>
-                <w:bCs/>
-              </w:rPr>
-              <w:t xml:space="preserve">0</w:t>
-            </w:r>
+            <m:oMath>
+              <m:r>
+                <m:t>0</m:t>
+              </m:r>
+            </m:oMath>
           </w:p>
         </w:tc>
       </w:tr>
@@ -9135,11 +9349,14 @@
         <w:t xml:space="preserve">Quoziente: </w:t>
       </w:r>
       <m:oMath>
+        <m:r>
+          <m:t>2</m:t>
+        </m:r>
         <m:sSup>
           <m:sSupPr/>
           <m:e>
             <m:r>
-              <m:t>t</m:t>
+              <m:t>x</m:t>
             </m:r>
           </m:e>
           <m:sup>
@@ -9149,11 +9366,133 @@
           </m:sup>
         </m:sSup>
         <m:r>
-          <m:t>+t−6=(t+3)(t−2)</m:t>
+          <m:t>+2x+2=2(</m:t>
+        </m:r>
+        <m:sSup>
+          <m:sSupPr/>
+          <m:e>
+            <m:r>
+              <m:t>x</m:t>
+            </m:r>
+          </m:e>
+          <m:sup>
+            <m:r>
+              <m:t>2</m:t>
+            </m:r>
+          </m:sup>
+        </m:sSup>
+        <m:r>
+          <m:t>+x+1)</m:t>
         </m:r>
       </m:oMath>
       <w:r>
         <w:t xml:space="preserve">.</w:t>
+      </w:r>
+    </w:p>
+    <w:p>
+      <w:pPr>
+        <w:pStyle w:val="ListParagraph"/>
+        <w:keepNext/>
+        <w:keepLines/>
+        <w:numPr>
+          <w:ilvl w:val="0"/>
+          <w:numId w:val="4"/>
+        </w:numPr>
+        <w:spacing w:after="40" w:before="20"/>
+      </w:pPr>
+      <w:r>
+        <w:t xml:space="preserve">Quindi </w:t>
+      </w:r>
+      <m:oMath>
+        <m:r>
+          <m:t>P(x)=(x−</m:t>
+        </m:r>
+        <m:f>
+          <m:num>
+            <m:r>
+              <m:t>1</m:t>
+            </m:r>
+          </m:num>
+          <m:den>
+            <m:r>
+              <m:t>2</m:t>
+            </m:r>
+          </m:den>
+        </m:f>
+        <m:r>
+          <m:t>)·2(</m:t>
+        </m:r>
+        <m:sSup>
+          <m:sSupPr/>
+          <m:e>
+            <m:r>
+              <m:t>x</m:t>
+            </m:r>
+          </m:e>
+          <m:sup>
+            <m:r>
+              <m:t>2</m:t>
+            </m:r>
+          </m:sup>
+        </m:sSup>
+        <m:r>
+          <m:t>+x+1)</m:t>
+        </m:r>
+      </m:oMath>
+      <w:r>
+        <w:t xml:space="preserve">: porto il </w:t>
+      </w:r>
+      <m:oMath>
+        <m:r>
+          <m:t>2</m:t>
+        </m:r>
+      </m:oMath>
+      <w:r>
+        <w:t xml:space="preserve"> dentro la prima parentesi, </w:t>
+      </w:r>
+      <m:oMath>
+        <m:r>
+          <m:t>2(x−</m:t>
+        </m:r>
+        <m:f>
+          <m:num>
+            <m:r>
+              <m:t>1</m:t>
+            </m:r>
+          </m:num>
+          <m:den>
+            <m:r>
+              <m:t>2</m:t>
+            </m:r>
+          </m:den>
+        </m:f>
+        <m:r>
+          <m:t>)=2x−1</m:t>
+        </m:r>
+      </m:oMath>
+      <w:r>
+        <w:t xml:space="preserve">. Il trinomio </w:t>
+      </w:r>
+      <m:oMath>
+        <m:sSup>
+          <m:sSupPr/>
+          <m:e>
+            <m:r>
+              <m:t>x</m:t>
+            </m:r>
+          </m:e>
+          <m:sup>
+            <m:r>
+              <m:t>2</m:t>
+            </m:r>
+          </m:sup>
+        </m:sSup>
+        <m:r>
+          <m:t>+x+1</m:t>
+        </m:r>
+      </m:oMath>
+      <w:r>
+        <w:t xml:space="preserve"> è irriducibile.</w:t>
       </w:r>
     </w:p>
     <w:p>
@@ -9176,7 +9515,23 @@
       </w:r>
       <m:oMath>
         <m:r>
-          <m:t>(t+1)(t+3)(t−2)</m:t>
+          <m:t>(2x−1)(</m:t>
+        </m:r>
+        <m:sSup>
+          <m:sSupPr/>
+          <m:e>
+            <m:r>
+              <m:t>x</m:t>
+            </m:r>
+          </m:e>
+          <m:sup>
+            <m:r>
+              <m:t>2</m:t>
+            </m:r>
+          </m:sup>
+        </m:sSup>
+        <m:r>
+          <m:t>+x+1)</m:t>
         </m:r>
       </m:oMath>
     </w:p>
@@ -9265,7 +9620,15 @@
               </m:r>
             </m:oMath>
             <w:r>
-              <w:t xml:space="preserve">.</w:t>
+              <w:t xml:space="preserve">. Se </w:t>
+            </w:r>
+            <m:oMath>
+              <m:r>
+                <m:t>k</m:t>
+              </m:r>
+            </m:oMath>
+            <w:r>
+              <w:t xml:space="preserve"> è una frazione, alla fine moltiplica il fattore per il denominatore per togliere la frazione.</w:t>
             </w:r>
           </w:p>
           <w:p>
@@ -9289,6 +9652,9 @@
               <w:t xml:space="preserve"> al posto dei termini mancanti, per esempio in </w:t>
             </w:r>
             <m:oMath>
+              <m:r>
+                <m:t>2</m:t>
+              </m:r>
               <m:sSup>
                 <m:sSupPr/>
                 <m:e>
@@ -9303,26 +9669,32 @@
                 </m:sup>
               </m:sSup>
               <m:r>
-                <m:t>−7x+6</m:t>
+                <m:t>+3</m:t>
+              </m:r>
+              <m:sSup>
+                <m:sSupPr/>
+                <m:e>
+                  <m:r>
+                    <m:t>x</m:t>
+                  </m:r>
+                </m:e>
+                <m:sup>
+                  <m:r>
+                    <m:t>2</m:t>
+                  </m:r>
+                </m:sup>
+              </m:sSup>
+              <m:r>
+                <m:t>−1</m:t>
               </m:r>
             </m:oMath>
             <w:r>
               <w:t xml:space="preserve"> manca il termine in </w:t>
             </w:r>
             <m:oMath>
-              <m:sSup>
-                <m:sSupPr/>
-                <m:e>
-                  <m:r>
-                    <m:t>x</m:t>
-                  </m:r>
-                </m:e>
-                <m:sup>
-                  <m:r>
-                    <m:t>2</m:t>
-                  </m:r>
-                </m:sup>
-              </m:sSup>
+              <m:r>
+                <m:t>x</m:t>
+              </m:r>
             </m:oMath>
             <w:r>
               <w:t xml:space="preserve">.</w:t>
@@ -9416,6 +9788,9 @@
         <w:t xml:space="preserve">19.   </w:t>
       </w:r>
       <m:oMath>
+        <m:r>
+          <m:t>2</m:t>
+        </m:r>
         <m:sSup>
           <m:sSupPr/>
           <m:e>
@@ -9430,7 +9805,23 @@
           </m:sup>
         </m:sSup>
         <m:r>
-          <m:t>−7x+6</m:t>
+          <m:t>+3</m:t>
+        </m:r>
+        <m:sSup>
+          <m:sSupPr/>
+          <m:e>
+            <m:r>
+              <m:t>x</m:t>
+            </m:r>
+          </m:e>
+          <m:sup>
+            <m:r>
+              <m:t>2</m:t>
+            </m:r>
+          </m:sup>
+        </m:sSup>
+        <m:r>
+          <m:t>−1</m:t>
         </m:r>
       </m:oMath>
       <w:r>
@@ -12527,6 +12918,9 @@
           </w:tcPr>
           <w:p>
             <m:oMath>
+              <m:r>
+                <m:t>2</m:t>
+              </m:r>
               <m:sSup>
                 <m:sSupPr/>
                 <m:e>
@@ -12541,7 +12935,23 @@
                 </m:sup>
               </m:sSup>
               <m:r>
-                <m:t>−7x+6</m:t>
+                <m:t>+3</m:t>
+              </m:r>
+              <m:sSup>
+                <m:sSupPr/>
+                <m:e>
+                  <m:r>
+                    <m:t>x</m:t>
+                  </m:r>
+                </m:e>
+                <m:sup>
+                  <m:r>
+                    <m:t>2</m:t>
+                  </m:r>
+                </m:sup>
+              </m:sSup>
+              <m:r>
+                <m:t>−1</m:t>
               </m:r>
             </m:oMath>
           </w:p>
@@ -12561,7 +12971,23 @@
           <w:p>
             <m:oMath>
               <m:r>
-                <m:t>(x−1)(x−2)(x+3)</m:t>
+                <m:t>(x+1</m:t>
+              </m:r>
+              <m:sSup>
+                <m:sSupPr/>
+                <m:e>
+                  <m:r>
+                    <m:t>)</m:t>
+                  </m:r>
+                </m:e>
+                <m:sup>
+                  <m:r>
+                    <m:t>2</m:t>
+                  </m:r>
+                </m:sup>
+              </m:sSup>
+              <m:r>
+                <m:t>(2x−1)</m:t>
               </m:r>
             </m:oMath>
           </w:p>

</xml_diff>